<commit_message>
U2 exercises: Part 1 / Part 2 labels; mirror a paragraph split from 2.1
- materials.json: unit2 exercise-set names are now "Part 1 — Financial
  statements (BS, P&L)" and "Part 2 — Corporate income tax (CIT)".
- Split the MAPACHE bullet about the tax liability/payroll from "MAPACHE has
  granted its employees a loan..." into its own bullet, mirroring a paragraph
  break Jorge added in 02.1 Exercises FS.docx (diffed both .docx paragraph by
  paragraph to confirm it was the only change). Refreshed
  materials/unit2-financial-statements.docx from the same source file.

Co-Authored-By: Claude Sonnet 5 <noreply@anthropic.com>
</commit_message>
<xml_diff>
--- a/materials/unit2-financial-statements.docx
+++ b/materials/unit2-financial-statements.docx
@@ -207,7 +207,22 @@
           <w:sz w:val="24"/>
           <w:szCs w:val="24"/>
         </w:rPr>
-        <w:t>The balance sheet as at 31/12/2023 shows a liability to the tax authorities of €8,640. Employees receive 14 monthly payments, with the extra payments made in June and December. The employer’s social security contribution is 20%, the employee’s contribution is 3%, and income tax withholding is 6%. Payments to Social Security are made monthly, and payments to the tax authorities are made quarterly. MAPACHE has granted its employees a loan of €33,840, which will be deducted from the 2024 payroll.</w:t>
+        <w:t xml:space="preserve">The balance sheet as at 31/12/2023 shows a liability to the tax authorities of €8,640. Employees receive 14 monthly payments, with the extra payments made in June and December. The employer’s social security contribution is 20%, the employee’s contribution is 3%, and income tax withholding is 6%. Payments to Social Security are made monthly, and payments to the tax authorities are made quarterly. </w:t>
+      </w:r>
+    </w:p>
+    <w:p>
+      <w:pPr>
+        <w:rPr>
+          <w:sz w:val="24"/>
+          <w:szCs w:val="24"/>
+        </w:rPr>
+      </w:pPr>
+      <w:r>
+        <w:rPr>
+          <w:sz w:val="24"/>
+          <w:szCs w:val="24"/>
+        </w:rPr>
+        <w:t>MAPACHE has granted its employees a loan of €33,840, which will be deducted from the 2024 payroll.</w:t>
       </w:r>
     </w:p>
     <w:p>

</xml_diff>